<commit_message>
Update Write-a-Cite quiz: italics reminder, title, and swap memo file
- Append a sentence to the instructions clarifying case names must be
  italicized (not underlined) and pointing students to their
  keyboard's italics shortcut.
- Rename the quiz picker card to "2021 Write-A-Cite".
- Replace the downloadable memo with the updated version (content is
  the same; only the marker formatting changed, so quiz questions and
  answer key are unaffected).

Co-Authored-By: Claude Sonnet 5 <noreply@anthropic.com>
Claude-Session: https://claude.ai/code/session_0139GgKJ1eR1JQCAVkFyCe1z
</commit_message>
<xml_diff>
--- a/downloads/fall-2021-memo.docx
+++ b/downloads/fall-2021-memo.docx
@@ -8,10 +8,7 @@
         <w:ind w:left="0" w:firstLine="0"/>
       </w:pPr>
       <w:r>
-        <w:t xml:space="preserve">Fall 2021 Quiz: </w:t>
-      </w:r>
-      <w:r>
-        <w:t xml:space="preserve">Memo </w:t>
+        <w:t xml:space="preserve">Fall 2021 Quiz: Memo </w:t>
       </w:r>
     </w:p>
     <w:p>
@@ -163,7 +160,23 @@
           <w:bCs/>
           <w:color w:val="0061FF"/>
         </w:rPr>
-        <w:t>#1</w:t>
+        <w:t>[#</w:t>
+      </w:r>
+      <w:r>
+        <w:rPr>
+          <w:b/>
+          <w:bCs/>
+          <w:color w:val="0061FF"/>
+        </w:rPr>
+        <w:t>1</w:t>
+      </w:r>
+      <w:r>
+        <w:rPr>
+          <w:b/>
+          <w:bCs/>
+          <w:color w:val="0061FF"/>
+        </w:rPr>
+        <w:t>]</w:t>
       </w:r>
       <w:r>
         <w:rPr>
@@ -180,13 +193,23 @@
           <w:bCs/>
           <w:color w:val="0061FF"/>
         </w:rPr>
-        <w:t>#2</w:t>
-      </w:r>
-      <w:r>
-        <w:rPr>
-          <w:color w:val="0061FF"/>
-        </w:rPr>
-        <w:t xml:space="preserve"> </w:t>
+        <w:t>[#</w:t>
+      </w:r>
+      <w:r>
+        <w:rPr>
+          <w:b/>
+          <w:bCs/>
+          <w:color w:val="0061FF"/>
+        </w:rPr>
+        <w:t>2</w:t>
+      </w:r>
+      <w:r>
+        <w:rPr>
+          <w:b/>
+          <w:bCs/>
+          <w:color w:val="0061FF"/>
+        </w:rPr>
+        <w:t>]</w:t>
       </w:r>
     </w:p>
     <w:p>
@@ -215,7 +238,23 @@
           <w:bCs/>
           <w:color w:val="0061FF"/>
         </w:rPr>
-        <w:t>#3</w:t>
+        <w:t>[#</w:t>
+      </w:r>
+      <w:r>
+        <w:rPr>
+          <w:b/>
+          <w:bCs/>
+          <w:color w:val="0061FF"/>
+        </w:rPr>
+        <w:t>3</w:t>
+      </w:r>
+      <w:r>
+        <w:rPr>
+          <w:b/>
+          <w:bCs/>
+          <w:color w:val="0061FF"/>
+        </w:rPr>
+        <w:t>]</w:t>
       </w:r>
       <w:r>
         <w:t xml:space="preserve"> </w:t>
@@ -229,7 +268,23 @@
           <w:bCs/>
           <w:color w:val="0061FF"/>
         </w:rPr>
-        <w:t>#4</w:t>
+        <w:t>[#</w:t>
+      </w:r>
+      <w:r>
+        <w:rPr>
+          <w:b/>
+          <w:bCs/>
+          <w:color w:val="0061FF"/>
+        </w:rPr>
+        <w:t>4</w:t>
+      </w:r>
+      <w:r>
+        <w:rPr>
+          <w:b/>
+          <w:bCs/>
+          <w:color w:val="0061FF"/>
+        </w:rPr>
+        <w:t>]</w:t>
       </w:r>
     </w:p>
     <w:p>
@@ -258,7 +313,31 @@
           <w:bCs/>
           <w:color w:val="0061FF"/>
         </w:rPr>
-        <w:t xml:space="preserve">#5 </w:t>
+        <w:t>[#</w:t>
+      </w:r>
+      <w:r>
+        <w:rPr>
+          <w:b/>
+          <w:bCs/>
+          <w:color w:val="0061FF"/>
+        </w:rPr>
+        <w:t>5</w:t>
+      </w:r>
+      <w:r>
+        <w:rPr>
+          <w:b/>
+          <w:bCs/>
+          <w:color w:val="0061FF"/>
+        </w:rPr>
+        <w:t>]</w:t>
+      </w:r>
+      <w:r>
+        <w:rPr>
+          <w:b/>
+          <w:bCs/>
+          <w:color w:val="0061FF"/>
+        </w:rPr>
+        <w:t xml:space="preserve"> </w:t>
       </w:r>
       <w:r>
         <w:t xml:space="preserve">The trespasser is liable to the landowner for twice the value of any “wood, timber, shrubs, or trees” that were “injured, cut, or removed.” </w:t>
@@ -269,9 +348,30 @@
           <w:bCs/>
           <w:color w:val="0061FF"/>
         </w:rPr>
-        <w:t>#6</w:t>
-      </w:r>
-      <w:r>
+        <w:t>[#</w:t>
+      </w:r>
+      <w:r>
+        <w:rPr>
+          <w:b/>
+          <w:bCs/>
+          <w:color w:val="0061FF"/>
+        </w:rPr>
+        <w:t>6</w:t>
+      </w:r>
+      <w:r>
+        <w:rPr>
+          <w:b/>
+          <w:bCs/>
+          <w:color w:val="0061FF"/>
+        </w:rPr>
+        <w:t>]</w:t>
+      </w:r>
+      <w:r>
+        <w:rPr>
+          <w:b/>
+          <w:bCs/>
+          <w:color w:val="0061FF"/>
+        </w:rPr>
         <w:t xml:space="preserve"> </w:t>
       </w:r>
       <w:r>
@@ -286,10 +386,28 @@
           <w:bCs/>
           <w:color w:val="0061FF"/>
         </w:rPr>
-        <w:t>#7</w:t>
-      </w:r>
-      <w:r>
-        <w:rPr>
+        <w:t>[#</w:t>
+      </w:r>
+      <w:r>
+        <w:rPr>
+          <w:b/>
+          <w:bCs/>
+          <w:color w:val="0061FF"/>
+        </w:rPr>
+        <w:t>7</w:t>
+      </w:r>
+      <w:r>
+        <w:rPr>
+          <w:b/>
+          <w:bCs/>
+          <w:color w:val="0061FF"/>
+        </w:rPr>
+        <w:t>]</w:t>
+      </w:r>
+      <w:r>
+        <w:rPr>
+          <w:b/>
+          <w:bCs/>
           <w:color w:val="0061FF"/>
         </w:rPr>
         <w:t xml:space="preserve"> </w:t>
@@ -303,9 +421,30 @@
           <w:bCs/>
           <w:color w:val="0061FF"/>
         </w:rPr>
-        <w:t>#8</w:t>
-      </w:r>
-      <w:r>
+        <w:t>[#</w:t>
+      </w:r>
+      <w:r>
+        <w:rPr>
+          <w:b/>
+          <w:bCs/>
+          <w:color w:val="0061FF"/>
+        </w:rPr>
+        <w:t>8</w:t>
+      </w:r>
+      <w:r>
+        <w:rPr>
+          <w:b/>
+          <w:bCs/>
+          <w:color w:val="0061FF"/>
+        </w:rPr>
+        <w:t>]</w:t>
+      </w:r>
+      <w:r>
+        <w:rPr>
+          <w:b/>
+          <w:bCs/>
+          <w:color w:val="0061FF"/>
+        </w:rPr>
         <w:t xml:space="preserve"> </w:t>
       </w:r>
       <w:r>
@@ -323,7 +462,23 @@
           <w:bCs/>
           <w:color w:val="0061FF"/>
         </w:rPr>
-        <w:t>#9</w:t>
+        <w:t>[#</w:t>
+      </w:r>
+      <w:r>
+        <w:rPr>
+          <w:b/>
+          <w:bCs/>
+          <w:color w:val="0061FF"/>
+        </w:rPr>
+        <w:t>9</w:t>
+      </w:r>
+      <w:r>
+        <w:rPr>
+          <w:b/>
+          <w:bCs/>
+          <w:color w:val="0061FF"/>
+        </w:rPr>
+        <w:t>]</w:t>
       </w:r>
     </w:p>
     <w:p>
@@ -352,7 +507,31 @@
           <w:bCs/>
           <w:color w:val="0061FF"/>
         </w:rPr>
-        <w:t xml:space="preserve">#10 </w:t>
+        <w:t>[#</w:t>
+      </w:r>
+      <w:r>
+        <w:rPr>
+          <w:b/>
+          <w:bCs/>
+          <w:color w:val="0061FF"/>
+        </w:rPr>
+        <w:t>10</w:t>
+      </w:r>
+      <w:r>
+        <w:rPr>
+          <w:b/>
+          <w:bCs/>
+          <w:color w:val="0061FF"/>
+        </w:rPr>
+        <w:t>]</w:t>
+      </w:r>
+      <w:r>
+        <w:rPr>
+          <w:b/>
+          <w:bCs/>
+          <w:color w:val="0061FF"/>
+        </w:rPr>
+        <w:t xml:space="preserve"> </w:t>
       </w:r>
       <w:r>
         <w:t xml:space="preserve">Ornamental trees do not have commercial value when cut, and therefore cutting ornamental trees cannot lead to enhanced statutory damages. </w:t>
@@ -363,7 +542,31 @@
           <w:bCs/>
           <w:color w:val="0061FF"/>
         </w:rPr>
-        <w:t xml:space="preserve">#11 </w:t>
+        <w:t>[#</w:t>
+      </w:r>
+      <w:r>
+        <w:rPr>
+          <w:b/>
+          <w:bCs/>
+          <w:color w:val="0061FF"/>
+        </w:rPr>
+        <w:t>11</w:t>
+      </w:r>
+      <w:r>
+        <w:rPr>
+          <w:b/>
+          <w:bCs/>
+          <w:color w:val="0061FF"/>
+        </w:rPr>
+        <w:t>]</w:t>
+      </w:r>
+      <w:r>
+        <w:rPr>
+          <w:b/>
+          <w:bCs/>
+          <w:color w:val="0061FF"/>
+        </w:rPr>
+        <w:t xml:space="preserve"> </w:t>
       </w:r>
       <w:r>
         <w:t xml:space="preserve">Poinciana’s magnolia trees were ornamental—they were beautiful to look at and produced pleasant smelling flowers during the summer. </w:t>
@@ -374,7 +577,31 @@
           <w:bCs/>
           <w:color w:val="0061FF"/>
         </w:rPr>
-        <w:t xml:space="preserve">#12 </w:t>
+        <w:t>[#</w:t>
+      </w:r>
+      <w:r>
+        <w:rPr>
+          <w:b/>
+          <w:bCs/>
+          <w:color w:val="0061FF"/>
+        </w:rPr>
+        <w:t>12</w:t>
+      </w:r>
+      <w:r>
+        <w:rPr>
+          <w:b/>
+          <w:bCs/>
+          <w:color w:val="0061FF"/>
+        </w:rPr>
+        <w:t>]</w:t>
+      </w:r>
+      <w:r>
+        <w:rPr>
+          <w:b/>
+          <w:bCs/>
+          <w:color w:val="0061FF"/>
+        </w:rPr>
+        <w:t xml:space="preserve"> </w:t>
       </w:r>
       <w:r>
         <w:t xml:space="preserve">They had no commercial value once cut, and thus Poinciana cannot recover double damages under the statute. </w:t>
@@ -385,7 +612,23 @@
           <w:bCs/>
           <w:color w:val="0061FF"/>
         </w:rPr>
-        <w:t xml:space="preserve">#13 </w:t>
+        <w:t>[#</w:t>
+      </w:r>
+      <w:r>
+        <w:rPr>
+          <w:b/>
+          <w:bCs/>
+          <w:color w:val="0061FF"/>
+        </w:rPr>
+        <w:t>13</w:t>
+      </w:r>
+      <w:r>
+        <w:rPr>
+          <w:b/>
+          <w:bCs/>
+          <w:color w:val="0061FF"/>
+        </w:rPr>
+        <w:t>]</w:t>
       </w:r>
     </w:p>
     <w:p>
@@ -410,10 +653,28 @@
           <w:bCs/>
           <w:color w:val="0061FF"/>
         </w:rPr>
-        <w:t>#14</w:t>
-      </w:r>
-      <w:r>
-        <w:rPr>
+        <w:t>[#</w:t>
+      </w:r>
+      <w:r>
+        <w:rPr>
+          <w:b/>
+          <w:bCs/>
+          <w:color w:val="0061FF"/>
+        </w:rPr>
+        <w:t>14</w:t>
+      </w:r>
+      <w:r>
+        <w:rPr>
+          <w:b/>
+          <w:bCs/>
+          <w:color w:val="0061FF"/>
+        </w:rPr>
+        <w:t>]</w:t>
+      </w:r>
+      <w:r>
+        <w:rPr>
+          <w:b/>
+          <w:bCs/>
           <w:color w:val="0061FF"/>
         </w:rPr>
         <w:t xml:space="preserve"> </w:t>
@@ -427,10 +688,28 @@
           <w:bCs/>
           <w:color w:val="0061FF"/>
         </w:rPr>
-        <w:t>#15</w:t>
-      </w:r>
-      <w:r>
-        <w:rPr>
+        <w:t>[#</w:t>
+      </w:r>
+      <w:r>
+        <w:rPr>
+          <w:b/>
+          <w:bCs/>
+          <w:color w:val="0061FF"/>
+        </w:rPr>
+        <w:t>15</w:t>
+      </w:r>
+      <w:r>
+        <w:rPr>
+          <w:b/>
+          <w:bCs/>
+          <w:color w:val="0061FF"/>
+        </w:rPr>
+        <w:t>]</w:t>
+      </w:r>
+      <w:r>
+        <w:rPr>
+          <w:b/>
+          <w:bCs/>
           <w:color w:val="0061FF"/>
         </w:rPr>
         <w:t xml:space="preserve"> </w:t>
@@ -444,10 +723,28 @@
           <w:bCs/>
           <w:color w:val="0061FF"/>
         </w:rPr>
-        <w:t>#16</w:t>
-      </w:r>
-      <w:r>
-        <w:rPr>
+        <w:t>[#</w:t>
+      </w:r>
+      <w:r>
+        <w:rPr>
+          <w:b/>
+          <w:bCs/>
+          <w:color w:val="0061FF"/>
+        </w:rPr>
+        <w:t>16</w:t>
+      </w:r>
+      <w:r>
+        <w:rPr>
+          <w:b/>
+          <w:bCs/>
+          <w:color w:val="0061FF"/>
+        </w:rPr>
+        <w:t>]</w:t>
+      </w:r>
+      <w:r>
+        <w:rPr>
+          <w:b/>
+          <w:bCs/>
           <w:color w:val="0061FF"/>
         </w:rPr>
         <w:t xml:space="preserve"> </w:t>
@@ -461,10 +758,28 @@
           <w:bCs/>
           <w:color w:val="0061FF"/>
         </w:rPr>
-        <w:t>#17</w:t>
-      </w:r>
-      <w:r>
-        <w:rPr>
+        <w:t>[#</w:t>
+      </w:r>
+      <w:r>
+        <w:rPr>
+          <w:b/>
+          <w:bCs/>
+          <w:color w:val="0061FF"/>
+        </w:rPr>
+        <w:t>17</w:t>
+      </w:r>
+      <w:r>
+        <w:rPr>
+          <w:b/>
+          <w:bCs/>
+          <w:color w:val="0061FF"/>
+        </w:rPr>
+        <w:t>]</w:t>
+      </w:r>
+      <w:r>
+        <w:rPr>
+          <w:b/>
+          <w:bCs/>
           <w:color w:val="0061FF"/>
         </w:rPr>
         <w:t xml:space="preserve"> </w:t>
@@ -478,7 +793,23 @@
           <w:bCs/>
           <w:color w:val="0061FF"/>
         </w:rPr>
-        <w:t>#18</w:t>
+        <w:t>[#</w:t>
+      </w:r>
+      <w:r>
+        <w:rPr>
+          <w:b/>
+          <w:bCs/>
+          <w:color w:val="0061FF"/>
+        </w:rPr>
+        <w:t>18</w:t>
+      </w:r>
+      <w:r>
+        <w:rPr>
+          <w:b/>
+          <w:bCs/>
+          <w:color w:val="0061FF"/>
+        </w:rPr>
+        <w:t>]</w:t>
       </w:r>
     </w:p>
     <w:p>
@@ -489,6 +820,12 @@
       <w:r>
         <w:t xml:space="preserve"> </w:t>
       </w:r>
+    </w:p>
+    <w:p>
+      <w:pPr>
+        <w:spacing w:line="259" w:lineRule="auto"/>
+        <w:ind w:left="1" w:firstLine="0"/>
+      </w:pPr>
     </w:p>
     <w:p>
       <w:pPr>
@@ -618,9 +955,16 @@
 <w:ftr xmlns:wpc="http://schemas.microsoft.com/office/word/2010/wordprocessingCanvas" xmlns:cx="http://schemas.microsoft.com/office/drawing/2014/chartex" xmlns:cx1="http://schemas.microsoft.com/office/drawing/2015/9/8/chartex" xmlns:cx2="http://schemas.microsoft.com/office/drawing/2015/10/21/chartex" xmlns:cx3="http://schemas.microsoft.com/office/drawing/2016/5/9/chartex" xmlns:cx4="http://schemas.microsoft.com/office/drawing/2016/5/10/chartex" xmlns:cx5="http://schemas.microsoft.com/office/drawing/2016/5/11/chartex" xmlns:cx6="http://schemas.microsoft.com/office/drawing/2016/5/12/chartex" xmlns:cx7="http://schemas.microsoft.com/office/drawing/2016/5/13/chartex" xmlns:cx8="http://schemas.microsoft.com/office/drawing/2016/5/14/chartex" xmlns:mc="http://schemas.openxmlformats.org/markup-compatibility/2006" xmlns:m="http://schemas.openxmlformats.org/officeDocument/2006/math" xmlns:aink="http://schemas.microsoft.com/office/drawing/2016/ink" xmlns:am3d="http://schemas.microsoft.com/office/drawing/2017/model3d" xmlns:oel="http://schemas.microsoft.com/office/2019/extlst" xmlns:r="http://schemas.openxmlformats.org/officeDocument/2006/relationships" xmlns:wp14="http://schemas.microsoft.com/office/word/2010/wordprocessingDrawing" xmlns:wp="http://schemas.openxmlformats.org/drawingml/2006/wordprocessingDrawing" xmlns:wpg="http://schemas.microsoft.com/office/word/2010/wordprocessingGroup" xmlns:wpi="http://schemas.microsoft.com/office/word/2010/wordprocessingInk" xmlns:wps="http://schemas.microsoft.com/office/word/2010/wordprocessingShape" xmlns:o="urn:schemas-microsoft-com:office:office" xmlns:v="urn:schemas-microsoft-com:vml" xmlns:w10="urn:schemas-microsoft-com:office:word" xmlns:w="http://schemas.openxmlformats.org/wordprocessingml/2006/main" xmlns:w14="http://schemas.microsoft.com/office/word/2010/wordml" xmlns:w15="http://schemas.microsoft.com/office/word/2012/wordml" xmlns:w16cei="http://schemas.microsoft.com/office/word/2026/wordml/cei" xmlns:w16cex="http://schemas.microsoft.com/office/word/2018/wordml/cex" xmlns:w16cid="http://schemas.microsoft.com/office/word/2016/wordml/cid" xmlns:w16="http://schemas.microsoft.com/office/word/2018/wordml" xmlns:w16sdtdh="http://schemas.microsoft.com/office/word/2020/wordml/sdtdatahash" xmlns:w16sdtfl="http://schemas.microsoft.com/office/word/2024/wordml/sdtformatlock" xmlns:w16se="http://schemas.microsoft.com/office/word/2015/wordml/symex" xmlns:w16du="http://schemas.microsoft.com/office/word/2023/wordml/word16du" xmlns:wne="http://schemas.microsoft.com/office/word/2006/wordml" mc:Ignorable="w14 w15 w16se w16cid w16 w16cex w16sdtdh w16sdtfl w16du wp14">
   <w:p>
     <w:pPr>
-      <w:spacing w:after="160" w:line="259" w:lineRule="auto"/>
-      <w:ind w:left="0" w:firstLine="0"/>
+      <w:spacing w:line="259" w:lineRule="auto"/>
+      <w:ind w:left="5" w:firstLine="0"/>
+      <w:jc w:val="center"/>
     </w:pPr>
+    <w:r>
+      <w:rPr>
+        <w:sz w:val="24"/>
+      </w:rPr>
+      <w:t>RRWA Fall 2021 Write-A-Cite Quiz</w:t>
+    </w:r>
   </w:p>
 </w:ftr>
 </file>

</xml_diff>